<commit_message>
Ajout de backend pour les pages
</commit_message>
<xml_diff>
--- a/Document Revision/Consignes/Enonce.docx
+++ b/Document Revision/Consignes/Enonce.docx
@@ -5985,12 +5985,7 @@
 </file>
 
 <file path=customXml/item1.xml><?xml version="1.0" encoding="utf-8"?>
-<?mso-contentType ?>
-<FormTemplates xmlns="http://schemas.microsoft.com/sharepoint/v3/contenttype/forms">
-  <Display>DocumentLibraryForm</Display>
-  <Edit>DocumentLibraryForm</Edit>
-  <New>DocumentLibraryForm</New>
-</FormTemplates>
+<b:Sources xmlns:b="http://schemas.openxmlformats.org/officeDocument/2006/bibliography" xmlns="http://schemas.openxmlformats.org/officeDocument/2006/bibliography" SelectedStyle="\APA.XSL" StyleName="APA Fifth Edition"/>
 </file>
 
 <file path=customXml/item2.xml><?xml version="1.0" encoding="utf-8"?>
@@ -6132,7 +6127,12 @@
 </file>
 
 <file path=customXml/item3.xml><?xml version="1.0" encoding="utf-8"?>
-<b:Sources xmlns:b="http://schemas.openxmlformats.org/officeDocument/2006/bibliography" xmlns="http://schemas.openxmlformats.org/officeDocument/2006/bibliography" SelectedStyle="\APA.XSL" StyleName="APA Fifth Edition"/>
+<?mso-contentType ?>
+<FormTemplates xmlns="http://schemas.microsoft.com/sharepoint/v3/contenttype/forms">
+  <Display>DocumentLibraryForm</Display>
+  <Edit>DocumentLibraryForm</Edit>
+  <New>DocumentLibraryForm</New>
+</FormTemplates>
 </file>
 
 <file path=customXml/item4.xml><?xml version="1.0" encoding="utf-8"?>
@@ -6142,9 +6142,9 @@
 </file>
 
 <file path=customXml/itemProps1.xml><?xml version="1.0" encoding="utf-8"?>
-<ds:datastoreItem xmlns:ds="http://schemas.openxmlformats.org/officeDocument/2006/customXml" ds:itemID="{236A035C-AABC-4C6C-A21E-C42C1A299D82}">
+<ds:datastoreItem xmlns:ds="http://schemas.openxmlformats.org/officeDocument/2006/customXml" ds:itemID="{036D4DC7-267B-4A16-B1AA-B9BFD9E7BBEE}">
   <ds:schemaRefs>
-    <ds:schemaRef ds:uri="http://schemas.microsoft.com/sharepoint/v3/contenttype/forms"/>
+    <ds:schemaRef ds:uri="http://schemas.openxmlformats.org/officeDocument/2006/bibliography"/>
   </ds:schemaRefs>
 </ds:datastoreItem>
 </file>
@@ -6168,9 +6168,9 @@
 </file>
 
 <file path=customXml/itemProps3.xml><?xml version="1.0" encoding="utf-8"?>
-<ds:datastoreItem xmlns:ds="http://schemas.openxmlformats.org/officeDocument/2006/customXml" ds:itemID="{036D4DC7-267B-4A16-B1AA-B9BFD9E7BBEE}">
+<ds:datastoreItem xmlns:ds="http://schemas.openxmlformats.org/officeDocument/2006/customXml" ds:itemID="{236A035C-AABC-4C6C-A21E-C42C1A299D82}">
   <ds:schemaRefs>
-    <ds:schemaRef ds:uri="http://schemas.openxmlformats.org/officeDocument/2006/bibliography"/>
+    <ds:schemaRef ds:uri="http://schemas.microsoft.com/sharepoint/v3/contenttype/forms"/>
   </ds:schemaRefs>
 </ds:datastoreItem>
 </file>

</xml_diff>